<commit_message>
Add sample-based layout post-processing and tests
</commit_message>
<xml_diff>
--- a/md2gost/templates/gost-7.32.docx
+++ b/md2gost/templates/gost-7.32.docx
@@ -1,6 +1,6 @@
 
 <file path=word/document.xml><?xml version="1.0" encoding="utf-8"?>
-<w:document xmlns:wpc="http://schemas.microsoft.com/office/word/2010/wordprocessingCanvas" xmlns:cx="http://schemas.microsoft.com/office/drawing/2014/chartex" xmlns:cx1="http://schemas.microsoft.com/office/drawing/2015/9/8/chartex" xmlns:cx2="http://schemas.microsoft.com/office/drawing/2015/10/21/chartex" xmlns:cx3="http://schemas.microsoft.com/office/drawing/2016/5/9/chartex" xmlns:cx4="http://schemas.microsoft.com/office/drawing/2016/5/10/chartex" xmlns:cx5="http://schemas.microsoft.com/office/drawing/2016/5/11/chartex" xmlns:cx6="http://schemas.microsoft.com/office/drawing/2016/5/12/chartex" xmlns:cx7="http://schemas.microsoft.com/office/drawing/2016/5/13/chartex" xmlns:cx8="http://schemas.microsoft.com/office/drawing/2016/5/14/chartex" xmlns:mc="http://schemas.openxmlformats.org/markup-compatibility/2006" xmlns:aink="http://schemas.microsoft.com/office/drawing/2016/ink" xmlns:am3d="http://schemas.microsoft.com/office/drawing/2017/model3d" xmlns:o="urn:schemas-microsoft-com:office:office" xmlns:oel="http://schemas.microsoft.com/office/2019/extlst" xmlns:r="http://schemas.openxmlformats.org/officeDocument/2006/relationships" xmlns:m="http://schemas.openxmlformats.org/officeDocument/2006/math" xmlns:v="urn:schemas-microsoft-com:vml" xmlns:wp14="http://schemas.microsoft.com/office/word/2010/wordprocessingDrawing" xmlns:wp="http://schemas.openxmlformats.org/drawingml/2006/wordprocessingDrawing" xmlns:w10="urn:schemas-microsoft-com:office:word" xmlns:w="http://schemas.openxmlformats.org/wordprocessingml/2006/main" xmlns:w14="http://schemas.microsoft.com/office/word/2010/wordml" xmlns:w15="http://schemas.microsoft.com/office/word/2012/wordml" xmlns:w16cex="http://schemas.microsoft.com/office/word/2018/wordml/cex" xmlns:w16cid="http://schemas.microsoft.com/office/word/2016/wordml/cid" xmlns:w16="http://schemas.microsoft.com/office/word/2018/wordml" xmlns:w16du="http://schemas.microsoft.com/office/word/2023/wordml/word16du" xmlns:w16sdtdh="http://schemas.microsoft.com/office/word/2020/wordml/sdtdatahash" xmlns:w16sdtfl="http://schemas.microsoft.com/office/word/2024/wordml/sdtformatlock" xmlns:w16se="http://schemas.microsoft.com/office/word/2015/wordml/symex" xmlns:wpg="http://schemas.microsoft.com/office/word/2010/wordprocessingGroup" xmlns:wpi="http://schemas.microsoft.com/office/word/2010/wordprocessingInk" xmlns:wne="http://schemas.microsoft.com/office/word/2006/wordml" xmlns:wps="http://schemas.microsoft.com/office/word/2010/wordprocessingShape" mc:Ignorable="w14 w15 w16se w16cid w16 w16cex w16sdtdh w16sdtfl w16du wp14">
+<w:document xmlns:a="http://schemas.openxmlformats.org/drawingml/2006/main" xmlns:mc="http://schemas.openxmlformats.org/markup-compatibility/2006" xmlns:pic="http://schemas.openxmlformats.org/drawingml/2006/picture" xmlns:r="http://schemas.openxmlformats.org/officeDocument/2006/relationships" xmlns:w="http://schemas.openxmlformats.org/wordprocessingml/2006/main" xmlns:w14="http://schemas.microsoft.com/office/word/2010/wordml" xmlns:wp="http://schemas.openxmlformats.org/drawingml/2006/wordprocessingDrawing" xmlns:wp14="http://schemas.microsoft.com/office/word/2010/wordprocessingDrawing" xmlns:wpc="http://schemas.microsoft.com/office/word/2010/wordprocessingCanvas" xmlns:cx="http://schemas.microsoft.com/office/drawing/2014/chartex" xmlns:cx1="http://schemas.microsoft.com/office/drawing/2015/9/8/chartex" xmlns:cx2="http://schemas.microsoft.com/office/drawing/2015/10/21/chartex" xmlns:cx3="http://schemas.microsoft.com/office/drawing/2016/5/9/chartex" xmlns:cx4="http://schemas.microsoft.com/office/drawing/2016/5/10/chartex" xmlns:cx5="http://schemas.microsoft.com/office/drawing/2016/5/11/chartex" xmlns:cx6="http://schemas.microsoft.com/office/drawing/2016/5/12/chartex" xmlns:cx7="http://schemas.microsoft.com/office/drawing/2016/5/13/chartex" xmlns:cx8="http://schemas.microsoft.com/office/drawing/2016/5/14/chartex" xmlns:aink="http://schemas.microsoft.com/office/drawing/2016/ink" xmlns:am3d="http://schemas.microsoft.com/office/drawing/2017/model3d" xmlns:o="urn:schemas-microsoft-com:office:office" xmlns:oel="http://schemas.microsoft.com/office/2019/extlst" xmlns:m="http://schemas.openxmlformats.org/officeDocument/2006/math" xmlns:v="urn:schemas-microsoft-com:vml" xmlns:w10="urn:schemas-microsoft-com:office:word" xmlns:w15="http://schemas.microsoft.com/office/word/2012/wordml" xmlns:w16cex="http://schemas.microsoft.com/office/word/2018/wordml/cex" xmlns:w16cid="http://schemas.microsoft.com/office/word/2016/wordml/cid" xmlns:w16="http://schemas.microsoft.com/office/word/2018/wordml" xmlns:w16du="http://schemas.microsoft.com/office/word/2023/wordml/word16du" xmlns:w16sdtdh="http://schemas.microsoft.com/office/word/2020/wordml/sdtdatahash" xmlns:w16sdtfl="http://schemas.microsoft.com/office/word/2024/wordml/sdtformatlock" xmlns:w16se="http://schemas.microsoft.com/office/word/2015/wordml/symex" xmlns:wpg="http://schemas.microsoft.com/office/word/2010/wordprocessingGroup" xmlns:wpi="http://schemas.microsoft.com/office/word/2010/wordprocessingInk" xmlns:wne="http://schemas.microsoft.com/office/word/2006/wordml" xmlns:wps="http://schemas.microsoft.com/office/word/2010/wordprocessingShape" mc:Ignorable="w14 w15 w16se w16cid w16 w16cex w16sdtdh w16sdtfl w16du wp14">
   <w:body>
     <w:p>
       <w:pPr>
@@ -393,9 +393,9 @@
             <wp:effectExtent l="0" t="0" r="0" b="0"/>
             <wp:docPr id="34" name="Picture" descr="Рис. 3. Идентификатор сессии, извлечённый через инструменты разработчика"/>
             <wp:cNvGraphicFramePr/>
-            <a:graphic xmlns:a="http://schemas.openxmlformats.org/drawingml/2006/main">
+            <a:graphic>
               <a:graphicData uri="http://schemas.openxmlformats.org/drawingml/2006/picture">
-                <pic:pic xmlns:pic="http://schemas.openxmlformats.org/drawingml/2006/picture">
+                <pic:pic>
                   <pic:nvPicPr>
                     <pic:cNvPr id="35" name="Picture" descr="devtools.png"/>
                     <pic:cNvPicPr>
@@ -477,15 +477,12 @@
       </w:r>
     </w:p>
     <w:sectPr>
-      <w:headerReference w:type="even" r:id="rId10"/>
-      <w:headerReference w:type="default" r:id="rId11"/>
       <w:footerReference w:type="even" r:id="rId12"/>
       <w:footerReference w:type="default" r:id="rId13"/>
-      <w:headerReference w:type="first" r:id="rId14"/>
       <w:footerReference w:type="first" r:id="rId15"/>
-      <w:pgSz w:w="12240" w:h="15840"/>
-      <w:pgMar w:top="1134" w:right="1134" w:bottom="1134" w:left="1134" w:header="720" w:footer="720" w:gutter="0"/>
       <w:cols w:space="720"/>
+      <w:pgSz w:w="11906" w:h="16838" w:orient="portrait"/>
+      <w:pgMar w:top="1134" w:bottom="1134" w:left="1701" w:right="567" w:header="709" w:footer="709" w:gutter="0"/>
     </w:sectPr>
   </w:body>
 </w:document>
@@ -511,17 +508,22 @@
 </file>
 
 <file path=word/footer1.xml><?xml version="1.0" encoding="utf-8"?>
-<w:ftr xmlns:wpc="http://schemas.microsoft.com/office/word/2010/wordprocessingCanvas" xmlns:cx="http://schemas.microsoft.com/office/drawing/2014/chartex" xmlns:cx1="http://schemas.microsoft.com/office/drawing/2015/9/8/chartex" xmlns:cx2="http://schemas.microsoft.com/office/drawing/2015/10/21/chartex" xmlns:cx3="http://schemas.microsoft.com/office/drawing/2016/5/9/chartex" xmlns:cx4="http://schemas.microsoft.com/office/drawing/2016/5/10/chartex" xmlns:cx5="http://schemas.microsoft.com/office/drawing/2016/5/11/chartex" xmlns:cx6="http://schemas.microsoft.com/office/drawing/2016/5/12/chartex" xmlns:cx7="http://schemas.microsoft.com/office/drawing/2016/5/13/chartex" xmlns:cx8="http://schemas.microsoft.com/office/drawing/2016/5/14/chartex" xmlns:mc="http://schemas.openxmlformats.org/markup-compatibility/2006" xmlns:aink="http://schemas.microsoft.com/office/drawing/2016/ink" xmlns:am3d="http://schemas.microsoft.com/office/drawing/2017/model3d" xmlns:o="urn:schemas-microsoft-com:office:office" xmlns:oel="http://schemas.microsoft.com/office/2019/extlst" xmlns:r="http://schemas.openxmlformats.org/officeDocument/2006/relationships" xmlns:m="http://schemas.openxmlformats.org/officeDocument/2006/math" xmlns:v="urn:schemas-microsoft-com:vml" xmlns:wp14="http://schemas.microsoft.com/office/word/2010/wordprocessingDrawing" xmlns:wp="http://schemas.openxmlformats.org/drawingml/2006/wordprocessingDrawing" xmlns:w10="urn:schemas-microsoft-com:office:word" xmlns:w="http://schemas.openxmlformats.org/wordprocessingml/2006/main" xmlns:w14="http://schemas.microsoft.com/office/word/2010/wordml" xmlns:w15="http://schemas.microsoft.com/office/word/2012/wordml" xmlns:w16cex="http://schemas.microsoft.com/office/word/2018/wordml/cex" xmlns:w16cid="http://schemas.microsoft.com/office/word/2016/wordml/cid" xmlns:w16="http://schemas.microsoft.com/office/word/2018/wordml" xmlns:w16du="http://schemas.microsoft.com/office/word/2023/wordml/word16du" xmlns:w16sdtdh="http://schemas.microsoft.com/office/word/2020/wordml/sdtdatahash" xmlns:w16sdtfl="http://schemas.microsoft.com/office/word/2024/wordml/sdtformatlock" xmlns:w16se="http://schemas.microsoft.com/office/word/2015/wordml/symex" xmlns:wpg="http://schemas.microsoft.com/office/word/2010/wordprocessingGroup" xmlns:wpi="http://schemas.microsoft.com/office/word/2010/wordprocessingInk" xmlns:wne="http://schemas.microsoft.com/office/word/2006/wordml" xmlns:wps="http://schemas.microsoft.com/office/word/2010/wordprocessingShape" mc:Ignorable="w14 w15 w16se w16cid w16 w16cex w16sdtdh w16sdtfl w16du wp14">
+<w:ftr xmlns:mc="http://schemas.openxmlformats.org/markup-compatibility/2006" xmlns:w="http://schemas.openxmlformats.org/wordprocessingml/2006/main" xmlns:w14="http://schemas.microsoft.com/office/word/2010/wordml" xmlns:wpc="http://schemas.microsoft.com/office/word/2010/wordprocessingCanvas" xmlns:cx="http://schemas.microsoft.com/office/drawing/2014/chartex" xmlns:cx1="http://schemas.microsoft.com/office/drawing/2015/9/8/chartex" xmlns:cx2="http://schemas.microsoft.com/office/drawing/2015/10/21/chartex" xmlns:cx3="http://schemas.microsoft.com/office/drawing/2016/5/9/chartex" xmlns:cx4="http://schemas.microsoft.com/office/drawing/2016/5/10/chartex" xmlns:cx5="http://schemas.microsoft.com/office/drawing/2016/5/11/chartex" xmlns:cx6="http://schemas.microsoft.com/office/drawing/2016/5/12/chartex" xmlns:cx7="http://schemas.microsoft.com/office/drawing/2016/5/13/chartex" xmlns:cx8="http://schemas.microsoft.com/office/drawing/2016/5/14/chartex" xmlns:aink="http://schemas.microsoft.com/office/drawing/2016/ink" xmlns:am3d="http://schemas.microsoft.com/office/drawing/2017/model3d" xmlns:o="urn:schemas-microsoft-com:office:office" xmlns:oel="http://schemas.microsoft.com/office/2019/extlst" xmlns:r="http://schemas.openxmlformats.org/officeDocument/2006/relationships" xmlns:m="http://schemas.openxmlformats.org/officeDocument/2006/math" xmlns:v="urn:schemas-microsoft-com:vml" xmlns:wp14="http://schemas.microsoft.com/office/word/2010/wordprocessingDrawing" xmlns:wp="http://schemas.openxmlformats.org/drawingml/2006/wordprocessingDrawing" xmlns:w10="urn:schemas-microsoft-com:office:word" xmlns:w15="http://schemas.microsoft.com/office/word/2012/wordml" xmlns:w16cex="http://schemas.microsoft.com/office/word/2018/wordml/cex" xmlns:w16cid="http://schemas.microsoft.com/office/word/2016/wordml/cid" xmlns:w16="http://schemas.microsoft.com/office/word/2018/wordml" xmlns:w16du="http://schemas.microsoft.com/office/word/2023/wordml/word16du" xmlns:w16sdtdh="http://schemas.microsoft.com/office/word/2020/wordml/sdtdatahash" xmlns:w16sdtfl="http://schemas.microsoft.com/office/word/2024/wordml/sdtformatlock" xmlns:w16se="http://schemas.microsoft.com/office/word/2015/wordml/symex" xmlns:wpg="http://schemas.microsoft.com/office/word/2010/wordprocessingGroup" xmlns:wpi="http://schemas.microsoft.com/office/word/2010/wordprocessingInk" xmlns:wne="http://schemas.microsoft.com/office/word/2006/wordml" xmlns:wps="http://schemas.microsoft.com/office/word/2010/wordprocessingShape" mc:Ignorable="w14 w15 w16se w16cid w16 w16cex w16sdtdh w16sdtfl w16du wp14">
   <w:p>
     <w:pPr>
       <w:pStyle w:val="af9"/>
+      <w:spacing w:before="0" w:after="0" w:line="240" w:lineRule="auto"/>
+      <w:ind w:left="0" w:right="0" w:firstLine="0"/>
+      <w:jc w:val="center"/>
+      <w:keepNext w:val="0"/>
+      <w:pageBreakBefore w:val="0"/>
     </w:pPr>
   </w:p>
 </w:ftr>
 </file>
 
 <file path=word/footer2.xml><?xml version="1.0" encoding="utf-8"?>
-<w:ftr xmlns:wpc="http://schemas.microsoft.com/office/word/2010/wordprocessingCanvas" xmlns:cx="http://schemas.microsoft.com/office/drawing/2014/chartex" xmlns:cx1="http://schemas.microsoft.com/office/drawing/2015/9/8/chartex" xmlns:cx2="http://schemas.microsoft.com/office/drawing/2015/10/21/chartex" xmlns:cx3="http://schemas.microsoft.com/office/drawing/2016/5/9/chartex" xmlns:cx4="http://schemas.microsoft.com/office/drawing/2016/5/10/chartex" xmlns:cx5="http://schemas.microsoft.com/office/drawing/2016/5/11/chartex" xmlns:cx6="http://schemas.microsoft.com/office/drawing/2016/5/12/chartex" xmlns:cx7="http://schemas.microsoft.com/office/drawing/2016/5/13/chartex" xmlns:cx8="http://schemas.microsoft.com/office/drawing/2016/5/14/chartex" xmlns:mc="http://schemas.openxmlformats.org/markup-compatibility/2006" xmlns:aink="http://schemas.microsoft.com/office/drawing/2016/ink" xmlns:am3d="http://schemas.microsoft.com/office/drawing/2017/model3d" xmlns:o="urn:schemas-microsoft-com:office:office" xmlns:oel="http://schemas.microsoft.com/office/2019/extlst" xmlns:r="http://schemas.openxmlformats.org/officeDocument/2006/relationships" xmlns:m="http://schemas.openxmlformats.org/officeDocument/2006/math" xmlns:v="urn:schemas-microsoft-com:vml" xmlns:wp14="http://schemas.microsoft.com/office/word/2010/wordprocessingDrawing" xmlns:wp="http://schemas.openxmlformats.org/drawingml/2006/wordprocessingDrawing" xmlns:w10="urn:schemas-microsoft-com:office:word" xmlns:w="http://schemas.openxmlformats.org/wordprocessingml/2006/main" xmlns:w14="http://schemas.microsoft.com/office/word/2010/wordml" xmlns:w15="http://schemas.microsoft.com/office/word/2012/wordml" xmlns:w16cex="http://schemas.microsoft.com/office/word/2018/wordml/cex" xmlns:w16cid="http://schemas.microsoft.com/office/word/2016/wordml/cid" xmlns:w16="http://schemas.microsoft.com/office/word/2018/wordml" xmlns:w16du="http://schemas.microsoft.com/office/word/2023/wordml/word16du" xmlns:w16sdtdh="http://schemas.microsoft.com/office/word/2020/wordml/sdtdatahash" xmlns:w16sdtfl="http://schemas.microsoft.com/office/word/2024/wordml/sdtformatlock" xmlns:w16se="http://schemas.microsoft.com/office/word/2015/wordml/symex" xmlns:wpg="http://schemas.microsoft.com/office/word/2010/wordprocessingGroup" xmlns:wpi="http://schemas.microsoft.com/office/word/2010/wordprocessingInk" xmlns:wne="http://schemas.microsoft.com/office/word/2006/wordml" xmlns:wps="http://schemas.microsoft.com/office/word/2010/wordprocessingShape" mc:Ignorable="w14 w15 w16se w16cid w16 w16cex w16sdtdh w16sdtfl w16du wp14">
+<w:ftr xmlns:mc="http://schemas.openxmlformats.org/markup-compatibility/2006" xmlns:w="http://schemas.openxmlformats.org/wordprocessingml/2006/main" xmlns:w14="http://schemas.microsoft.com/office/word/2010/wordml" xmlns:wpc="http://schemas.microsoft.com/office/word/2010/wordprocessingCanvas" xmlns:cx="http://schemas.microsoft.com/office/drawing/2014/chartex" xmlns:cx1="http://schemas.microsoft.com/office/drawing/2015/9/8/chartex" xmlns:cx2="http://schemas.microsoft.com/office/drawing/2015/10/21/chartex" xmlns:cx3="http://schemas.microsoft.com/office/drawing/2016/5/9/chartex" xmlns:cx4="http://schemas.microsoft.com/office/drawing/2016/5/10/chartex" xmlns:cx5="http://schemas.microsoft.com/office/drawing/2016/5/11/chartex" xmlns:cx6="http://schemas.microsoft.com/office/drawing/2016/5/12/chartex" xmlns:cx7="http://schemas.microsoft.com/office/drawing/2016/5/13/chartex" xmlns:cx8="http://schemas.microsoft.com/office/drawing/2016/5/14/chartex" xmlns:aink="http://schemas.microsoft.com/office/drawing/2016/ink" xmlns:am3d="http://schemas.microsoft.com/office/drawing/2017/model3d" xmlns:o="urn:schemas-microsoft-com:office:office" xmlns:oel="http://schemas.microsoft.com/office/2019/extlst" xmlns:r="http://schemas.openxmlformats.org/officeDocument/2006/relationships" xmlns:m="http://schemas.openxmlformats.org/officeDocument/2006/math" xmlns:v="urn:schemas-microsoft-com:vml" xmlns:wp14="http://schemas.microsoft.com/office/word/2010/wordprocessingDrawing" xmlns:wp="http://schemas.openxmlformats.org/drawingml/2006/wordprocessingDrawing" xmlns:w10="urn:schemas-microsoft-com:office:word" xmlns:w15="http://schemas.microsoft.com/office/word/2012/wordml" xmlns:w16cex="http://schemas.microsoft.com/office/word/2018/wordml/cex" xmlns:w16cid="http://schemas.microsoft.com/office/word/2016/wordml/cid" xmlns:w16="http://schemas.microsoft.com/office/word/2018/wordml" xmlns:w16du="http://schemas.microsoft.com/office/word/2023/wordml/word16du" xmlns:w16sdtdh="http://schemas.microsoft.com/office/word/2020/wordml/sdtdatahash" xmlns:w16sdtfl="http://schemas.microsoft.com/office/word/2024/wordml/sdtformatlock" xmlns:w16se="http://schemas.microsoft.com/office/word/2015/wordml/symex" xmlns:wpg="http://schemas.microsoft.com/office/word/2010/wordprocessingGroup" xmlns:wpi="http://schemas.microsoft.com/office/word/2010/wordprocessingInk" xmlns:wne="http://schemas.microsoft.com/office/word/2006/wordml" xmlns:wps="http://schemas.microsoft.com/office/word/2010/wordprocessingShape" mc:Ignorable="w14 w15 w16se w16cid w16 w16cex w16sdtdh w16sdtfl w16du wp14">
   <w:sdt>
     <w:sdtPr>
       <w:id w:val="-1735846448"/>
@@ -534,20 +536,65 @@
       <w:p>
         <w:pPr>
           <w:pStyle w:val="af9"/>
+          <w:spacing w:before="0" w:after="0" w:line="240" w:lineRule="auto"/>
+          <w:ind w:left="0" w:right="0" w:firstLine="0"/>
+          <w:jc w:val="center"/>
+          <w:keepNext w:val="0"/>
+          <w:pageBreakBefore w:val="0"/>
         </w:pPr>
         <w:r>
+          <w:rPr>
+            <w:rFonts w:ascii="Times New Roman" w:hAnsi="Times New Roman" w:cs="Times New Roman"/>
+            <w:sz w:val="24"/>
+            <w:szCs w:val="24"/>
+            <w:color w:val="000000"/>
+            <w:b w:val="0"/>
+            <w:i w:val="0"/>
+          </w:rPr>
           <w:fldChar w:fldCharType="begin"/>
         </w:r>
         <w:r>
+          <w:rPr>
+            <w:rFonts w:ascii="Times New Roman" w:hAnsi="Times New Roman" w:cs="Times New Roman"/>
+            <w:sz w:val="24"/>
+            <w:szCs w:val="24"/>
+            <w:color w:val="000000"/>
+            <w:b w:val="0"/>
+            <w:i w:val="0"/>
+          </w:rPr>
           <w:instrText>PAGE   \* MERGEFORMAT</w:instrText>
         </w:r>
         <w:r>
+          <w:rPr>
+            <w:rFonts w:ascii="Times New Roman" w:hAnsi="Times New Roman" w:cs="Times New Roman"/>
+            <w:sz w:val="24"/>
+            <w:szCs w:val="24"/>
+            <w:color w:val="000000"/>
+            <w:b w:val="0"/>
+            <w:i w:val="0"/>
+          </w:rPr>
           <w:fldChar w:fldCharType="separate"/>
         </w:r>
         <w:r>
+          <w:rPr>
+            <w:rFonts w:ascii="Times New Roman" w:hAnsi="Times New Roman" w:cs="Times New Roman"/>
+            <w:sz w:val="24"/>
+            <w:szCs w:val="24"/>
+            <w:color w:val="000000"/>
+            <w:b w:val="0"/>
+            <w:i w:val="0"/>
+          </w:rPr>
           <w:t>2</w:t>
         </w:r>
         <w:r>
+          <w:rPr>
+            <w:rFonts w:ascii="Times New Roman" w:hAnsi="Times New Roman" w:cs="Times New Roman"/>
+            <w:sz w:val="24"/>
+            <w:szCs w:val="24"/>
+            <w:color w:val="000000"/>
+            <w:b w:val="0"/>
+            <w:i w:val="0"/>
+          </w:rPr>
           <w:fldChar w:fldCharType="end"/>
         </w:r>
       </w:p>
@@ -556,16 +603,26 @@
   <w:p>
     <w:pPr>
       <w:pStyle w:val="af9"/>
+      <w:spacing w:before="0" w:after="0" w:line="240" w:lineRule="auto"/>
+      <w:ind w:left="0" w:right="0" w:firstLine="0"/>
+      <w:jc w:val="center"/>
+      <w:keepNext w:val="0"/>
+      <w:pageBreakBefore w:val="0"/>
     </w:pPr>
   </w:p>
 </w:ftr>
 </file>
 
 <file path=word/footer3.xml><?xml version="1.0" encoding="utf-8"?>
-<w:ftr xmlns:wpc="http://schemas.microsoft.com/office/word/2010/wordprocessingCanvas" xmlns:cx="http://schemas.microsoft.com/office/drawing/2014/chartex" xmlns:cx1="http://schemas.microsoft.com/office/drawing/2015/9/8/chartex" xmlns:cx2="http://schemas.microsoft.com/office/drawing/2015/10/21/chartex" xmlns:cx3="http://schemas.microsoft.com/office/drawing/2016/5/9/chartex" xmlns:cx4="http://schemas.microsoft.com/office/drawing/2016/5/10/chartex" xmlns:cx5="http://schemas.microsoft.com/office/drawing/2016/5/11/chartex" xmlns:cx6="http://schemas.microsoft.com/office/drawing/2016/5/12/chartex" xmlns:cx7="http://schemas.microsoft.com/office/drawing/2016/5/13/chartex" xmlns:cx8="http://schemas.microsoft.com/office/drawing/2016/5/14/chartex" xmlns:mc="http://schemas.openxmlformats.org/markup-compatibility/2006" xmlns:aink="http://schemas.microsoft.com/office/drawing/2016/ink" xmlns:am3d="http://schemas.microsoft.com/office/drawing/2017/model3d" xmlns:o="urn:schemas-microsoft-com:office:office" xmlns:oel="http://schemas.microsoft.com/office/2019/extlst" xmlns:r="http://schemas.openxmlformats.org/officeDocument/2006/relationships" xmlns:m="http://schemas.openxmlformats.org/officeDocument/2006/math" xmlns:v="urn:schemas-microsoft-com:vml" xmlns:wp14="http://schemas.microsoft.com/office/word/2010/wordprocessingDrawing" xmlns:wp="http://schemas.openxmlformats.org/drawingml/2006/wordprocessingDrawing" xmlns:w10="urn:schemas-microsoft-com:office:word" xmlns:w="http://schemas.openxmlformats.org/wordprocessingml/2006/main" xmlns:w14="http://schemas.microsoft.com/office/word/2010/wordml" xmlns:w15="http://schemas.microsoft.com/office/word/2012/wordml" xmlns:w16cex="http://schemas.microsoft.com/office/word/2018/wordml/cex" xmlns:w16cid="http://schemas.microsoft.com/office/word/2016/wordml/cid" xmlns:w16="http://schemas.microsoft.com/office/word/2018/wordml" xmlns:w16du="http://schemas.microsoft.com/office/word/2023/wordml/word16du" xmlns:w16sdtdh="http://schemas.microsoft.com/office/word/2020/wordml/sdtdatahash" xmlns:w16sdtfl="http://schemas.microsoft.com/office/word/2024/wordml/sdtformatlock" xmlns:w16se="http://schemas.microsoft.com/office/word/2015/wordml/symex" xmlns:wpg="http://schemas.microsoft.com/office/word/2010/wordprocessingGroup" xmlns:wpi="http://schemas.microsoft.com/office/word/2010/wordprocessingInk" xmlns:wne="http://schemas.microsoft.com/office/word/2006/wordml" xmlns:wps="http://schemas.microsoft.com/office/word/2010/wordprocessingShape" mc:Ignorable="w14 w15 w16se w16cid w16 w16cex w16sdtdh w16sdtfl w16du wp14">
+<w:ftr xmlns:mc="http://schemas.openxmlformats.org/markup-compatibility/2006" xmlns:w="http://schemas.openxmlformats.org/wordprocessingml/2006/main" xmlns:w14="http://schemas.microsoft.com/office/word/2010/wordml" xmlns:wpc="http://schemas.microsoft.com/office/word/2010/wordprocessingCanvas" xmlns:cx="http://schemas.microsoft.com/office/drawing/2014/chartex" xmlns:cx1="http://schemas.microsoft.com/office/drawing/2015/9/8/chartex" xmlns:cx2="http://schemas.microsoft.com/office/drawing/2015/10/21/chartex" xmlns:cx3="http://schemas.microsoft.com/office/drawing/2016/5/9/chartex" xmlns:cx4="http://schemas.microsoft.com/office/drawing/2016/5/10/chartex" xmlns:cx5="http://schemas.microsoft.com/office/drawing/2016/5/11/chartex" xmlns:cx6="http://schemas.microsoft.com/office/drawing/2016/5/12/chartex" xmlns:cx7="http://schemas.microsoft.com/office/drawing/2016/5/13/chartex" xmlns:cx8="http://schemas.microsoft.com/office/drawing/2016/5/14/chartex" xmlns:aink="http://schemas.microsoft.com/office/drawing/2016/ink" xmlns:am3d="http://schemas.microsoft.com/office/drawing/2017/model3d" xmlns:o="urn:schemas-microsoft-com:office:office" xmlns:oel="http://schemas.microsoft.com/office/2019/extlst" xmlns:r="http://schemas.openxmlformats.org/officeDocument/2006/relationships" xmlns:m="http://schemas.openxmlformats.org/officeDocument/2006/math" xmlns:v="urn:schemas-microsoft-com:vml" xmlns:wp14="http://schemas.microsoft.com/office/word/2010/wordprocessingDrawing" xmlns:wp="http://schemas.openxmlformats.org/drawingml/2006/wordprocessingDrawing" xmlns:w10="urn:schemas-microsoft-com:office:word" xmlns:w15="http://schemas.microsoft.com/office/word/2012/wordml" xmlns:w16cex="http://schemas.microsoft.com/office/word/2018/wordml/cex" xmlns:w16cid="http://schemas.microsoft.com/office/word/2016/wordml/cid" xmlns:w16="http://schemas.microsoft.com/office/word/2018/wordml" xmlns:w16du="http://schemas.microsoft.com/office/word/2023/wordml/word16du" xmlns:w16sdtdh="http://schemas.microsoft.com/office/word/2020/wordml/sdtdatahash" xmlns:w16sdtfl="http://schemas.microsoft.com/office/word/2024/wordml/sdtformatlock" xmlns:w16se="http://schemas.microsoft.com/office/word/2015/wordml/symex" xmlns:wpg="http://schemas.microsoft.com/office/word/2010/wordprocessingGroup" xmlns:wpi="http://schemas.microsoft.com/office/word/2010/wordprocessingInk" xmlns:wne="http://schemas.microsoft.com/office/word/2006/wordml" xmlns:wps="http://schemas.microsoft.com/office/word/2010/wordprocessingShape" mc:Ignorable="w14 w15 w16se w16cid w16 w16cex w16sdtdh w16sdtfl w16du wp14">
   <w:p>
     <w:pPr>
       <w:pStyle w:val="af9"/>
+      <w:spacing w:before="0" w:after="0" w:line="240" w:lineRule="auto"/>
+      <w:ind w:left="0" w:right="0" w:firstLine="0"/>
+      <w:jc w:val="center"/>
+      <w:keepNext w:val="0"/>
+      <w:pageBreakBefore w:val="0"/>
     </w:pPr>
   </w:p>
 </w:ftr>
@@ -637,7 +694,7 @@
 </file>
 
 <file path=word/numbering.xml><?xml version="1.0" encoding="utf-8"?>
-<w:numbering xmlns:wpc="http://schemas.microsoft.com/office/word/2010/wordprocessingCanvas" xmlns:cx="http://schemas.microsoft.com/office/drawing/2014/chartex" xmlns:cx1="http://schemas.microsoft.com/office/drawing/2015/9/8/chartex" xmlns:cx2="http://schemas.microsoft.com/office/drawing/2015/10/21/chartex" xmlns:cx3="http://schemas.microsoft.com/office/drawing/2016/5/9/chartex" xmlns:cx4="http://schemas.microsoft.com/office/drawing/2016/5/10/chartex" xmlns:cx5="http://schemas.microsoft.com/office/drawing/2016/5/11/chartex" xmlns:cx6="http://schemas.microsoft.com/office/drawing/2016/5/12/chartex" xmlns:cx7="http://schemas.microsoft.com/office/drawing/2016/5/13/chartex" xmlns:cx8="http://schemas.microsoft.com/office/drawing/2016/5/14/chartex" xmlns:mc="http://schemas.openxmlformats.org/markup-compatibility/2006" xmlns:aink="http://schemas.microsoft.com/office/drawing/2016/ink" xmlns:am3d="http://schemas.microsoft.com/office/drawing/2017/model3d" xmlns:o="urn:schemas-microsoft-com:office:office" xmlns:oel="http://schemas.microsoft.com/office/2019/extlst" xmlns:r="http://schemas.openxmlformats.org/officeDocument/2006/relationships" xmlns:m="http://schemas.openxmlformats.org/officeDocument/2006/math" xmlns:v="urn:schemas-microsoft-com:vml" xmlns:wp14="http://schemas.microsoft.com/office/word/2010/wordprocessingDrawing" xmlns:wp="http://schemas.openxmlformats.org/drawingml/2006/wordprocessingDrawing" xmlns:w10="urn:schemas-microsoft-com:office:word" xmlns:w="http://schemas.openxmlformats.org/wordprocessingml/2006/main" xmlns:w14="http://schemas.microsoft.com/office/word/2010/wordml" xmlns:w15="http://schemas.microsoft.com/office/word/2012/wordml" xmlns:w16cex="http://schemas.microsoft.com/office/word/2018/wordml/cex" xmlns:w16cid="http://schemas.microsoft.com/office/word/2016/wordml/cid" xmlns:w16="http://schemas.microsoft.com/office/word/2018/wordml" xmlns:w16du="http://schemas.microsoft.com/office/word/2023/wordml/word16du" xmlns:w16sdtdh="http://schemas.microsoft.com/office/word/2020/wordml/sdtdatahash" xmlns:w16sdtfl="http://schemas.microsoft.com/office/word/2024/wordml/sdtformatlock" xmlns:w16se="http://schemas.microsoft.com/office/word/2015/wordml/symex" xmlns:wpg="http://schemas.microsoft.com/office/word/2010/wordprocessingGroup" xmlns:wpi="http://schemas.microsoft.com/office/word/2010/wordprocessingInk" xmlns:wne="http://schemas.microsoft.com/office/word/2006/wordml" xmlns:wps="http://schemas.microsoft.com/office/word/2010/wordprocessingShape" mc:Ignorable="w14 w15 w16se w16cid w16 w16cex w16sdtdh w16sdtfl w16du wp14">
+<w:numbering xmlns:mc="http://schemas.openxmlformats.org/markup-compatibility/2006" xmlns:w="http://schemas.openxmlformats.org/wordprocessingml/2006/main" xmlns:w15="http://schemas.microsoft.com/office/word/2012/wordml" xmlns:w16cid="http://schemas.microsoft.com/office/word/2016/wordml/cid" xmlns:wpc="http://schemas.microsoft.com/office/word/2010/wordprocessingCanvas" xmlns:cx="http://schemas.microsoft.com/office/drawing/2014/chartex" xmlns:cx1="http://schemas.microsoft.com/office/drawing/2015/9/8/chartex" xmlns:cx2="http://schemas.microsoft.com/office/drawing/2015/10/21/chartex" xmlns:cx3="http://schemas.microsoft.com/office/drawing/2016/5/9/chartex" xmlns:cx4="http://schemas.microsoft.com/office/drawing/2016/5/10/chartex" xmlns:cx5="http://schemas.microsoft.com/office/drawing/2016/5/11/chartex" xmlns:cx6="http://schemas.microsoft.com/office/drawing/2016/5/12/chartex" xmlns:cx7="http://schemas.microsoft.com/office/drawing/2016/5/13/chartex" xmlns:cx8="http://schemas.microsoft.com/office/drawing/2016/5/14/chartex" xmlns:aink="http://schemas.microsoft.com/office/drawing/2016/ink" xmlns:am3d="http://schemas.microsoft.com/office/drawing/2017/model3d" xmlns:o="urn:schemas-microsoft-com:office:office" xmlns:oel="http://schemas.microsoft.com/office/2019/extlst" xmlns:r="http://schemas.openxmlformats.org/officeDocument/2006/relationships" xmlns:m="http://schemas.openxmlformats.org/officeDocument/2006/math" xmlns:v="urn:schemas-microsoft-com:vml" xmlns:wp14="http://schemas.microsoft.com/office/word/2010/wordprocessingDrawing" xmlns:wp="http://schemas.openxmlformats.org/drawingml/2006/wordprocessingDrawing" xmlns:w10="urn:schemas-microsoft-com:office:word" xmlns:w14="http://schemas.microsoft.com/office/word/2010/wordml" xmlns:w16cex="http://schemas.microsoft.com/office/word/2018/wordml/cex" xmlns:w16="http://schemas.microsoft.com/office/word/2018/wordml" xmlns:w16du="http://schemas.microsoft.com/office/word/2023/wordml/word16du" xmlns:w16sdtdh="http://schemas.microsoft.com/office/word/2020/wordml/sdtdatahash" xmlns:w16sdtfl="http://schemas.microsoft.com/office/word/2024/wordml/sdtformatlock" xmlns:w16se="http://schemas.microsoft.com/office/word/2015/wordml/symex" xmlns:wpg="http://schemas.microsoft.com/office/word/2010/wordprocessingGroup" xmlns:wpi="http://schemas.microsoft.com/office/word/2010/wordprocessingInk" xmlns:wne="http://schemas.microsoft.com/office/word/2006/wordml" xmlns:wps="http://schemas.microsoft.com/office/word/2010/wordprocessingShape" mc:Ignorable="w14 w15 w16se w16cid w16 w16cex w16sdtdh w16sdtfl w16du wp14">
   <w:abstractNum w:abstractNumId="0" w15:restartNumberingAfterBreak="0">
     <w:nsid w:val="FFFFFF7C"/>
     <w:multiLevelType w:val="singleLevel"/>
@@ -715,7 +772,7 @@
       <w:start w:val="1"/>
       <w:numFmt w:val="bullet"/>
       <w:pStyle w:val="5"/>
-      <w:lvlText w:val=""/>
+      <w:lvlText w:val="–"/>
       <w:lvlJc w:val="left"/>
       <w:pPr>
         <w:tabs>
@@ -724,7 +781,7 @@
         <w:ind w:left="1492" w:hanging="360"/>
       </w:pPr>
       <w:rPr>
-        <w:rFonts w:ascii="Symbol" w:hAnsi="Symbol" w:hint="default"/>
+        <w:rFonts w:ascii="Times New Roman" w:hAnsi="Times New Roman" w:hint="default"/>
       </w:rPr>
     </w:lvl>
   </w:abstractNum>
@@ -736,7 +793,7 @@
       <w:start w:val="1"/>
       <w:numFmt w:val="bullet"/>
       <w:pStyle w:val="4"/>
-      <w:lvlText w:val=""/>
+      <w:lvlText w:val="–"/>
       <w:lvlJc w:val="left"/>
       <w:pPr>
         <w:tabs>
@@ -745,7 +802,7 @@
         <w:ind w:left="1209" w:hanging="360"/>
       </w:pPr>
       <w:rPr>
-        <w:rFonts w:ascii="Symbol" w:hAnsi="Symbol" w:hint="default"/>
+        <w:rFonts w:ascii="Times New Roman" w:hAnsi="Times New Roman" w:hint="default"/>
       </w:rPr>
     </w:lvl>
   </w:abstractNum>
@@ -757,7 +814,7 @@
       <w:start w:val="1"/>
       <w:numFmt w:val="bullet"/>
       <w:pStyle w:val="3"/>
-      <w:lvlText w:val=""/>
+      <w:lvlText w:val="–"/>
       <w:lvlJc w:val="left"/>
       <w:pPr>
         <w:tabs>
@@ -766,7 +823,7 @@
         <w:ind w:left="926" w:hanging="360"/>
       </w:pPr>
       <w:rPr>
-        <w:rFonts w:ascii="Symbol" w:hAnsi="Symbol" w:hint="default"/>
+        <w:rFonts w:ascii="Times New Roman" w:hAnsi="Times New Roman" w:hint="default"/>
       </w:rPr>
     </w:lvl>
   </w:abstractNum>
@@ -778,7 +835,7 @@
       <w:start w:val="1"/>
       <w:numFmt w:val="bullet"/>
       <w:pStyle w:val="20"/>
-      <w:lvlText w:val=""/>
+      <w:lvlText w:val="–"/>
       <w:lvlJc w:val="left"/>
       <w:pPr>
         <w:tabs>
@@ -787,7 +844,7 @@
         <w:ind w:left="643" w:hanging="360"/>
       </w:pPr>
       <w:rPr>
-        <w:rFonts w:ascii="Symbol" w:hAnsi="Symbol" w:hint="default"/>
+        <w:rFonts w:ascii="Times New Roman" w:hAnsi="Times New Roman" w:hint="default"/>
       </w:rPr>
     </w:lvl>
   </w:abstractNum>
@@ -817,7 +874,7 @@
       <w:start w:val="1"/>
       <w:numFmt w:val="bullet"/>
       <w:pStyle w:val="a0"/>
-      <w:lvlText w:val=""/>
+      <w:lvlText w:val="–"/>
       <w:lvlJc w:val="left"/>
       <w:pPr>
         <w:tabs>
@@ -826,7 +883,7 @@
         <w:ind w:left="360" w:hanging="360"/>
       </w:pPr>
       <w:rPr>
-        <w:rFonts w:ascii="Symbol" w:hAnsi="Symbol" w:hint="default"/>
+        <w:rFonts w:ascii="Times New Roman" w:hAnsi="Times New Roman" w:hint="default"/>
       </w:rPr>
     </w:lvl>
   </w:abstractNum>
@@ -835,72 +892,99 @@
     <w:multiLevelType w:val="multilevel"/>
     <w:tmpl w:val="133C2E4C"/>
     <w:lvl w:ilvl="0">
-      <w:numFmt w:val="bullet"/>
-      <w:lvlText w:val="•"/>
-      <w:lvlJc w:val="left"/>
-      <w:pPr>
-        <w:ind w:left="720" w:hanging="480"/>
-      </w:pPr>
-    </w:lvl>
-    <w:lvl w:ilvl="1">
+      <w:rPr>
+        <w:rFonts w:ascii="Times New Roman" w:hAnsi="Times New Roman"/>
+      </w:rPr>
       <w:numFmt w:val="bullet"/>
       <w:lvlText w:val="–"/>
       <w:lvlJc w:val="left"/>
       <w:pPr>
-        <w:ind w:left="1440" w:hanging="480"/>
+        <w:ind w:left="720" w:hanging="480"/>
       </w:pPr>
     </w:lvl>
-    <w:lvl w:ilvl="2">
-      <w:numFmt w:val="bullet"/>
-      <w:lvlText w:val="•"/>
-      <w:lvlJc w:val="left"/>
-      <w:pPr>
-        <w:ind w:left="2160" w:hanging="480"/>
-      </w:pPr>
-    </w:lvl>
-    <w:lvl w:ilvl="3">
+    <w:lvl w:ilvl="1">
+      <w:rPr>
+        <w:rFonts w:ascii="Times New Roman" w:hAnsi="Times New Roman"/>
+      </w:rPr>
       <w:numFmt w:val="bullet"/>
       <w:lvlText w:val="–"/>
       <w:lvlJc w:val="left"/>
       <w:pPr>
-        <w:ind w:left="2880" w:hanging="480"/>
+        <w:ind w:left="1440" w:hanging="480"/>
       </w:pPr>
     </w:lvl>
-    <w:lvl w:ilvl="4">
-      <w:numFmt w:val="bullet"/>
-      <w:lvlText w:val="•"/>
-      <w:lvlJc w:val="left"/>
-      <w:pPr>
-        <w:ind w:left="3600" w:hanging="480"/>
-      </w:pPr>
-    </w:lvl>
-    <w:lvl w:ilvl="5">
+    <w:lvl w:ilvl="2">
+      <w:rPr>
+        <w:rFonts w:ascii="Times New Roman" w:hAnsi="Times New Roman"/>
+      </w:rPr>
       <w:numFmt w:val="bullet"/>
       <w:lvlText w:val="–"/>
       <w:lvlJc w:val="left"/>
       <w:pPr>
-        <w:ind w:left="4320" w:hanging="480"/>
+        <w:ind w:left="2160" w:hanging="480"/>
       </w:pPr>
     </w:lvl>
-    <w:lvl w:ilvl="6">
-      <w:numFmt w:val="bullet"/>
-      <w:lvlText w:val="•"/>
-      <w:lvlJc w:val="left"/>
-      <w:pPr>
-        <w:ind w:left="5040" w:hanging="480"/>
-      </w:pPr>
-    </w:lvl>
-    <w:lvl w:ilvl="7">
+    <w:lvl w:ilvl="3">
+      <w:rPr>
+        <w:rFonts w:ascii="Times New Roman" w:hAnsi="Times New Roman"/>
+      </w:rPr>
       <w:numFmt w:val="bullet"/>
       <w:lvlText w:val="–"/>
       <w:lvlJc w:val="left"/>
       <w:pPr>
+        <w:ind w:left="2880" w:hanging="480"/>
+      </w:pPr>
+    </w:lvl>
+    <w:lvl w:ilvl="4">
+      <w:rPr>
+        <w:rFonts w:ascii="Times New Roman" w:hAnsi="Times New Roman"/>
+      </w:rPr>
+      <w:numFmt w:val="bullet"/>
+      <w:lvlText w:val="–"/>
+      <w:lvlJc w:val="left"/>
+      <w:pPr>
+        <w:ind w:left="3600" w:hanging="480"/>
+      </w:pPr>
+    </w:lvl>
+    <w:lvl w:ilvl="5">
+      <w:rPr>
+        <w:rFonts w:ascii="Times New Roman" w:hAnsi="Times New Roman"/>
+      </w:rPr>
+      <w:numFmt w:val="bullet"/>
+      <w:lvlText w:val="–"/>
+      <w:lvlJc w:val="left"/>
+      <w:pPr>
+        <w:ind w:left="4320" w:hanging="480"/>
+      </w:pPr>
+    </w:lvl>
+    <w:lvl w:ilvl="6">
+      <w:rPr>
+        <w:rFonts w:ascii="Times New Roman" w:hAnsi="Times New Roman"/>
+      </w:rPr>
+      <w:numFmt w:val="bullet"/>
+      <w:lvlText w:val="–"/>
+      <w:lvlJc w:val="left"/>
+      <w:pPr>
+        <w:ind w:left="5040" w:hanging="480"/>
+      </w:pPr>
+    </w:lvl>
+    <w:lvl w:ilvl="7">
+      <w:rPr>
+        <w:rFonts w:ascii="Times New Roman" w:hAnsi="Times New Roman"/>
+      </w:rPr>
+      <w:numFmt w:val="bullet"/>
+      <w:lvlText w:val="–"/>
+      <w:lvlJc w:val="left"/>
+      <w:pPr>
         <w:ind w:left="5760" w:hanging="480"/>
       </w:pPr>
     </w:lvl>
     <w:lvl w:ilvl="8">
+      <w:rPr>
+        <w:rFonts w:ascii="Times New Roman" w:hAnsi="Times New Roman"/>
+      </w:rPr>
       <w:numFmt w:val="bullet"/>
-      <w:lvlText w:val="•"/>
+      <w:lvlText w:val="–"/>
       <w:lvlJc w:val="left"/>
       <w:pPr>
         <w:ind w:left="6480" w:hanging="480"/>
@@ -1386,15 +1470,22 @@
   <w:docDefaults>
     <w:rPrDefault>
       <w:rPr>
-        <w:rFonts w:asciiTheme="minorHAnsi" w:eastAsiaTheme="minorHAnsi" w:hAnsiTheme="minorHAnsi" w:cstheme="minorBidi"/>
-        <w:sz w:val="24"/>
-        <w:szCs w:val="24"/>
         <w:lang w:val="en-US" w:eastAsia="en-US" w:bidi="ar-SA"/>
+        <w:rFonts w:ascii="Times New Roman" w:hAnsi="Times New Roman" w:cs="Times New Roman"/>
+        <w:sz w:val="28"/>
+        <w:szCs w:val="28"/>
+        <w:color w:val="000000"/>
+        <w:b w:val="0"/>
+        <w:i w:val="0"/>
       </w:rPr>
     </w:rPrDefault>
     <w:pPrDefault>
       <w:pPr>
-        <w:spacing w:after="200"/>
+        <w:spacing w:before="0" w:after="0" w:line="360" w:lineRule="auto"/>
+        <w:ind w:left="0" w:right="0" w:firstLine="709"/>
+        <w:jc w:val="both"/>
+        <w:keepNext w:val="0"/>
+        <w:pageBreakBefore w:val="0"/>
       </w:pPr>
     </w:pPrDefault>
   </w:docDefaults>
@@ -1743,12 +1834,20 @@
     <w:qFormat/>
     <w:rsid w:val="00B32334"/>
     <w:pPr>
-      <w:spacing w:after="0" w:line="312" w:lineRule="auto"/>
+      <w:suppressAutoHyphens w:val="1"/>
+      <w:spacing w:before="0" w:after="0" w:line="360" w:lineRule="auto"/>
+      <w:ind w:left="0" w:right="0" w:firstLine="709"/>
       <w:jc w:val="both"/>
-    </w:pPr>
-    <w:rPr>
-      <w:rFonts w:ascii="Times New Roman" w:hAnsi="Times New Roman"/>
+      <w:keepNext w:val="0"/>
+      <w:pageBreakBefore w:val="0"/>
+    </w:pPr>
+    <w:rPr>
+      <w:rFonts w:ascii="Times New Roman" w:hAnsi="Times New Roman" w:cs="Times New Roman"/>
       <w:sz w:val="28"/>
+      <w:szCs w:val="28"/>
+      <w:color w:val="000000"/>
+      <w:b w:val="0"/>
+      <w:i w:val="0"/>
     </w:rPr>
   </w:style>
   <w:style w:type="paragraph" w:styleId="1">
@@ -1759,18 +1858,20 @@
     <w:qFormat/>
     <w:rsid w:val="008E0AF4"/>
     <w:pPr>
-      <w:keepNext/>
-      <w:keepLines/>
-      <w:spacing w:after="360"/>
-      <w:jc w:val="center"/>
       <w:outlineLvl w:val="0"/>
-    </w:pPr>
-    <w:rPr>
-      <w:rFonts w:eastAsiaTheme="majorEastAsia" w:cstheme="majorBidi"/>
-      <w:b/>
-      <w:bCs/>
+      <w:spacing w:before="0" w:after="240" w:line="360" w:lineRule="auto"/>
+      <w:ind w:left="0" w:right="0" w:firstLine="709"/>
+      <w:jc w:val="both"/>
+      <w:keepNext w:val="1"/>
+      <w:pageBreakBefore w:val="1"/>
+    </w:pPr>
+    <w:rPr>
+      <w:rFonts w:ascii="Times New Roman" w:hAnsi="Times New Roman" w:cs="Times New Roman"/>
       <w:sz w:val="36"/>
       <w:szCs w:val="36"/>
+      <w:color w:val="000000"/>
+      <w:b w:val="1"/>
+      <w:i w:val="0"/>
     </w:rPr>
   </w:style>
   <w:style w:type="paragraph" w:styleId="21">
@@ -1782,19 +1883,20 @@
     <w:qFormat/>
     <w:rsid w:val="00965F46"/>
     <w:pPr>
-      <w:keepNext/>
-      <w:keepLines/>
-      <w:spacing w:before="360" w:after="360"/>
-      <w:ind w:firstLine="709"/>
-      <w:jc w:val="left"/>
       <w:outlineLvl w:val="1"/>
-    </w:pPr>
-    <w:rPr>
-      <w:rFonts w:eastAsiaTheme="majorEastAsia" w:cstheme="majorBidi"/>
-      <w:b/>
-      <w:bCs/>
-      <w:szCs w:val="36"/>
-      <w:sz w:val="36"/>
+      <w:spacing w:before="480" w:after="240" w:line="360" w:lineRule="auto"/>
+      <w:ind w:left="0" w:right="0" w:firstLine="709"/>
+      <w:jc w:val="both"/>
+      <w:keepNext w:val="1"/>
+      <w:pageBreakBefore w:val="0"/>
+    </w:pPr>
+    <w:rPr>
+      <w:rFonts w:ascii="Times New Roman" w:hAnsi="Times New Roman" w:cs="Times New Roman"/>
+      <w:sz w:val="32"/>
+      <w:szCs w:val="32"/>
+      <w:color w:val="000000"/>
+      <w:b w:val="1"/>
+      <w:i w:val="0"/>
     </w:rPr>
   </w:style>
   <w:style w:type="paragraph" w:styleId="30">
@@ -1806,19 +1908,20 @@
     <w:qFormat/>
     <w:rsid w:val="008E0AF4"/>
     <w:pPr>
-      <w:keepNext/>
-      <w:keepLines/>
-      <w:spacing w:before="360"/>
-      <w:ind w:firstLine="709"/>
-      <w:jc w:val="left"/>
       <w:outlineLvl w:val="2"/>
-    </w:pPr>
-    <w:rPr>
-      <w:rFonts w:eastAsiaTheme="majorEastAsia" w:cstheme="majorBidi"/>
-      <w:b/>
-      <w:bCs/>
-      <w:sz w:val="32"/>
-      <w:szCs w:val="32"/>
+      <w:spacing w:before="480" w:after="240" w:line="360" w:lineRule="auto"/>
+      <w:ind w:left="0" w:right="0" w:firstLine="709"/>
+      <w:jc w:val="both"/>
+      <w:keepNext w:val="1"/>
+      <w:pageBreakBefore w:val="0"/>
+    </w:pPr>
+    <w:rPr>
+      <w:rFonts w:ascii="Times New Roman" w:hAnsi="Times New Roman" w:cs="Times New Roman"/>
+      <w:sz w:val="28"/>
+      <w:szCs w:val="28"/>
+      <w:color w:val="000000"/>
+      <w:b w:val="1"/>
+      <w:i w:val="0"/>
     </w:rPr>
   </w:style>
   <w:style w:type="paragraph" w:styleId="40">
@@ -1830,16 +1933,20 @@
     <w:qFormat/>
     <w:rsid w:val="008F072B"/>
     <w:pPr>
-      <w:keepNext/>
-      <w:keepLines/>
-      <w:spacing w:before="200"/>
-      <w:ind w:firstLine="709"/>
       <w:outlineLvl w:val="3"/>
-    </w:pPr>
-    <w:rPr>
-      <w:rFonts w:eastAsiaTheme="majorEastAsia" w:cstheme="majorBidi"/>
-      <w:b/>
-      <w:bCs/>
+      <w:spacing w:before="480" w:after="240" w:line="360" w:lineRule="auto"/>
+      <w:ind w:left="0" w:right="0" w:firstLine="709"/>
+      <w:jc w:val="both"/>
+      <w:keepNext w:val="1"/>
+      <w:pageBreakBefore w:val="0"/>
+    </w:pPr>
+    <w:rPr>
+      <w:rFonts w:ascii="Times New Roman" w:hAnsi="Times New Roman" w:cs="Times New Roman"/>
+      <w:sz w:val="28"/>
+      <w:szCs w:val="28"/>
+      <w:color w:val="000000"/>
+      <w:b w:val="1"/>
+      <w:i w:val="0"/>
     </w:rPr>
   </w:style>
   <w:style w:type="paragraph" w:styleId="50">
@@ -1851,16 +1958,20 @@
     <w:qFormat/>
     <w:rsid w:val="008F072B"/>
     <w:pPr>
-      <w:keepNext/>
-      <w:keepLines/>
-      <w:spacing w:before="200"/>
-      <w:ind w:firstLine="709"/>
       <w:outlineLvl w:val="4"/>
-    </w:pPr>
-    <w:rPr>
-      <w:rFonts w:eastAsiaTheme="majorEastAsia" w:cstheme="majorBidi"/>
-      <w:b/>
-      <w:bCs/>
+      <w:spacing w:before="480" w:after="240" w:line="360" w:lineRule="auto"/>
+      <w:ind w:left="0" w:right="0" w:firstLine="709"/>
+      <w:jc w:val="both"/>
+      <w:keepNext w:val="1"/>
+      <w:pageBreakBefore w:val="0"/>
+    </w:pPr>
+    <w:rPr>
+      <w:rFonts w:ascii="Times New Roman" w:hAnsi="Times New Roman" w:cs="Times New Roman"/>
+      <w:sz w:val="28"/>
+      <w:szCs w:val="28"/>
+      <w:color w:val="000000"/>
+      <w:b w:val="1"/>
+      <w:i w:val="0"/>
     </w:rPr>
   </w:style>
   <w:style w:type="paragraph" w:styleId="6">
@@ -1872,16 +1983,20 @@
     <w:qFormat/>
     <w:rsid w:val="008F072B"/>
     <w:pPr>
-      <w:keepNext/>
-      <w:keepLines/>
-      <w:spacing w:before="200"/>
-      <w:ind w:firstLine="709"/>
       <w:outlineLvl w:val="5"/>
-    </w:pPr>
-    <w:rPr>
-      <w:rFonts w:eastAsiaTheme="majorEastAsia" w:cstheme="majorBidi"/>
-      <w:b/>
-      <w:bCs/>
+      <w:spacing w:before="480" w:after="240" w:line="360" w:lineRule="auto"/>
+      <w:ind w:left="0" w:right="0" w:firstLine="709"/>
+      <w:jc w:val="both"/>
+      <w:keepNext w:val="1"/>
+      <w:pageBreakBefore w:val="0"/>
+    </w:pPr>
+    <w:rPr>
+      <w:rFonts w:ascii="Times New Roman" w:hAnsi="Times New Roman" w:cs="Times New Roman"/>
+      <w:sz w:val="28"/>
+      <w:szCs w:val="28"/>
+      <w:color w:val="000000"/>
+      <w:b w:val="1"/>
+      <w:i w:val="0"/>
     </w:rPr>
   </w:style>
   <w:style w:type="paragraph" w:styleId="7">
@@ -1966,16 +2081,45 @@
     <w:unhideWhenUsed/>
   </w:style>
   <w:style w:type="paragraph" w:styleId="a2">
+    <w:rPr>
+      <w:rFonts w:ascii="Times New Roman" w:hAnsi="Times New Roman" w:cs="Times New Roman"/>
+      <w:sz w:val="28"/>
+      <w:szCs w:val="28"/>
+      <w:color w:val="000000"/>
+      <w:b w:val="0"/>
+      <w:i w:val="0"/>
+    </w:rPr>
     <w:name w:val="Body Text"/>
     <w:basedOn w:val="a1"/>
     <w:link w:val="a6"/>
     <w:qFormat/>
     <w:rsid w:val="00633A2D"/>
     <w:pPr>
-      <w:ind w:firstLine="567"/>
+      <w:suppressAutoHyphens w:val="1"/>
+      <w:spacing w:before="0" w:after="0" w:line="360" w:lineRule="auto"/>
+      <w:ind w:left="0" w:right="0" w:firstLine="709"/>
+      <w:jc w:val="both"/>
+      <w:keepNext w:val="0"/>
+      <w:pageBreakBefore w:val="0"/>
     </w:pPr>
   </w:style>
   <w:style w:type="paragraph" w:customStyle="1" w:styleId="FirstParagraph">
+    <w:rPr>
+      <w:rFonts w:ascii="Times New Roman" w:hAnsi="Times New Roman" w:cs="Times New Roman"/>
+      <w:sz w:val="28"/>
+      <w:szCs w:val="28"/>
+      <w:color w:val="000000"/>
+      <w:b w:val="0"/>
+      <w:i w:val="0"/>
+    </w:rPr>
+    <w:pPr>
+      <w:suppressAutoHyphens w:val="1"/>
+      <w:spacing w:before="0" w:after="0" w:line="360" w:lineRule="auto"/>
+      <w:ind w:left="0" w:right="0" w:firstLine="709"/>
+      <w:jc w:val="both"/>
+      <w:keepNext w:val="0"/>
+      <w:pageBreakBefore w:val="0"/>
+    </w:pPr>
     <w:name w:val="First Paragraph"/>
     <w:basedOn w:val="a2"/>
     <w:next w:val="a2"/>
@@ -1983,14 +2127,25 @@
     <w:rsid w:val="000E6990"/>
   </w:style>
   <w:style w:type="paragraph" w:customStyle="1" w:styleId="Compact">
+    <w:rPr>
+      <w:rFonts w:ascii="Times New Roman" w:hAnsi="Times New Roman" w:cs="Times New Roman"/>
+      <w:sz w:val="28"/>
+      <w:szCs w:val="28"/>
+      <w:color w:val="000000"/>
+      <w:b w:val="0"/>
+      <w:i w:val="0"/>
+    </w:rPr>
     <w:name w:val="Compact"/>
     <w:basedOn w:val="a2"/>
     <w:qFormat/>
     <w:rsid w:val="009969EB"/>
     <w:pPr>
-      <w:spacing w:after="36"/>
-      <w:ind w:firstLine="0"/>
-      <w:jc w:val="left"/>
+      <w:suppressAutoHyphens w:val="1"/>
+      <w:spacing w:before="0" w:after="0" w:line="360" w:lineRule="auto"/>
+      <w:ind w:left="0" w:right="0" w:firstLine="709"/>
+      <w:jc w:val="both"/>
+      <w:keepNext w:val="0"/>
+      <w:pageBreakBefore w:val="0"/>
     </w:pPr>
   </w:style>
   <w:style w:type="paragraph" w:styleId="a7">
@@ -2077,12 +2232,25 @@
     </w:rPr>
   </w:style>
   <w:style w:type="paragraph" w:styleId="ad">
+    <w:rPr>
+      <w:rFonts w:ascii="Times New Roman" w:hAnsi="Times New Roman" w:cs="Times New Roman"/>
+      <w:sz w:val="28"/>
+      <w:szCs w:val="28"/>
+      <w:color w:val="000000"/>
+      <w:b w:val="0"/>
+      <w:i w:val="0"/>
+    </w:rPr>
     <w:name w:val="Bibliography"/>
     <w:basedOn w:val="a2"/>
     <w:qFormat/>
     <w:rsid w:val="00E87A44"/>
     <w:pPr>
-      <w:ind w:firstLine="0"/>
+      <w:suppressAutoHyphens w:val="1"/>
+      <w:spacing w:before="0" w:after="0" w:line="360" w:lineRule="auto"/>
+      <w:ind w:left="0" w:right="0" w:firstLine="709"/>
+      <w:jc w:val="both"/>
+      <w:keepNext w:val="0"/>
+      <w:pageBreakBefore w:val="0"/>
     </w:pPr>
   </w:style>
   <w:style w:type="paragraph" w:styleId="ae">
@@ -2182,12 +2350,19 @@
     <w:basedOn w:val="af1"/>
     <w:rsid w:val="00234F5D"/>
     <w:pPr>
-      <w:keepNext/>
       <w:spacing w:before="120" w:after="120" w:line="240" w:lineRule="auto"/>
-      <w:jc w:val="right"/>
-    </w:pPr>
-    <w:rPr>
-      <w:szCs w:val="26"/>
+      <w:ind w:left="0" w:right="0" w:firstLine="0"/>
+      <w:jc w:val="left"/>
+      <w:keepNext w:val="1"/>
+      <w:pageBreakBefore w:val="0"/>
+    </w:pPr>
+    <w:rPr>
+      <w:rFonts w:ascii="Times New Roman" w:hAnsi="Times New Roman" w:cs="Times New Roman"/>
+      <w:sz w:val="24"/>
+      <w:szCs w:val="24"/>
+      <w:color w:val="000000"/>
+      <w:b w:val="0"/>
+      <w:i w:val="1"/>
     </w:rPr>
   </w:style>
   <w:style w:type="paragraph" w:customStyle="1" w:styleId="ImageCaption">
@@ -2195,30 +2370,59 @@
     <w:basedOn w:val="af1"/>
     <w:rsid w:val="00CC64F9"/>
     <w:pPr>
-      <w:keepLines/>
-      <w:spacing w:before="120" w:after="120" w:line="240" w:lineRule="auto"/>
+      <w:spacing w:before="0" w:after="120" w:line="240" w:lineRule="auto"/>
+      <w:ind w:left="0" w:right="0" w:firstLine="0"/>
       <w:jc w:val="center"/>
-    </w:pPr>
-    <w:rPr>
-      <w:b/>
+      <w:keepNext w:val="0"/>
+      <w:pageBreakBefore w:val="0"/>
+    </w:pPr>
+    <w:rPr>
+      <w:rFonts w:ascii="Times New Roman" w:hAnsi="Times New Roman" w:cs="Times New Roman"/>
       <w:sz w:val="24"/>
+      <w:szCs w:val="24"/>
+      <w:color w:val="000000"/>
+      <w:b w:val="1"/>
+      <w:i w:val="0"/>
     </w:rPr>
   </w:style>
   <w:style w:type="paragraph" w:customStyle="1" w:styleId="Figure">
+    <w:rPr>
+      <w:rFonts w:ascii="Times New Roman" w:hAnsi="Times New Roman" w:cs="Times New Roman"/>
+      <w:sz w:val="28"/>
+      <w:szCs w:val="28"/>
+      <w:color w:val="000000"/>
+      <w:b w:val="0"/>
+      <w:i w:val="0"/>
+    </w:rPr>
     <w:name w:val="Figure"/>
     <w:basedOn w:val="a1"/>
     <w:rsid w:val="00320C66"/>
     <w:pPr>
+      <w:spacing w:before="0" w:after="0" w:line="240" w:lineRule="auto"/>
+      <w:ind w:left="0" w:right="0" w:firstLine="0"/>
       <w:jc w:val="center"/>
+      <w:keepNext w:val="1"/>
+      <w:pageBreakBefore w:val="0"/>
     </w:pPr>
   </w:style>
   <w:style w:type="paragraph" w:customStyle="1" w:styleId="CaptionedFigure">
+    <w:rPr>
+      <w:rFonts w:ascii="Times New Roman" w:hAnsi="Times New Roman" w:cs="Times New Roman"/>
+      <w:sz w:val="28"/>
+      <w:szCs w:val="28"/>
+      <w:color w:val="000000"/>
+      <w:b w:val="0"/>
+      <w:i w:val="0"/>
+    </w:rPr>
     <w:name w:val="Captioned Figure"/>
     <w:basedOn w:val="Figure"/>
     <w:rsid w:val="005D1A72"/>
     <w:pPr>
-      <w:keepNext/>
-      <w:spacing w:before="240" w:line="240" w:lineRule="auto"/>
+      <w:spacing w:before="0" w:after="0" w:line="240" w:lineRule="auto"/>
+      <w:ind w:left="0" w:right="0" w:firstLine="0"/>
+      <w:jc w:val="center"/>
+      <w:keepNext w:val="1"/>
+      <w:pageBreakBefore w:val="0"/>
     </w:pPr>
   </w:style>
   <w:style w:type="character" w:customStyle="1" w:styleId="af2">
@@ -2232,8 +2436,12 @@
     <w:link w:val="SourceCode"/>
     <w:rsid w:val="00690B7F"/>
     <w:rPr>
-      <w:rFonts w:ascii="Consolas" w:hAnsi="Consolas"/>
-      <w:sz w:val="22"/>
+      <w:rFonts w:ascii="Courier New" w:hAnsi="Courier New" w:cs="Courier New"/>
+      <w:sz w:val="20"/>
+      <w:szCs w:val="20"/>
+      <w:color w:val="000000"/>
+      <w:b w:val="0"/>
+      <w:i w:val="0"/>
     </w:rPr>
   </w:style>
   <w:style w:type="character" w:customStyle="1" w:styleId="SectionNumber">
@@ -2264,11 +2472,20 @@
     <w:qFormat/>
     <w:rsid w:val="00136237"/>
     <w:pPr>
-      <w:spacing w:before="240" w:after="240" w:line="259" w:lineRule="auto"/>
       <w:outlineLvl w:val="9"/>
-    </w:pPr>
-    <w:rPr>
-      <w:bCs w:val="0"/>
+      <w:spacing w:before="0" w:after="240" w:line="360" w:lineRule="auto"/>
+      <w:ind w:left="0" w:right="0" w:firstLine="0"/>
+      <w:jc w:val="center"/>
+      <w:keepNext w:val="1"/>
+      <w:pageBreakBefore w:val="1"/>
+    </w:pPr>
+    <w:rPr>
+      <w:rFonts w:ascii="Times New Roman" w:hAnsi="Times New Roman" w:cs="Times New Roman"/>
+      <w:sz w:val="36"/>
+      <w:szCs w:val="36"/>
+      <w:color w:val="000000"/>
+      <w:b w:val="1"/>
+      <w:i w:val="0"/>
     </w:rPr>
   </w:style>
   <w:style w:type="paragraph" w:customStyle="1" w:styleId="SourceCode">
@@ -2278,12 +2495,19 @@
     <w:rsid w:val="00690B7F"/>
     <w:pPr>
       <w:wordWrap w:val="0"/>
-      <w:spacing w:before="120" w:after="120"/>
+      <w:spacing w:before="0" w:after="0" w:line="240" w:lineRule="auto"/>
+      <w:ind w:left="0" w:right="0" w:firstLine="0"/>
       <w:jc w:val="left"/>
-    </w:pPr>
-    <w:rPr>
-      <w:rFonts w:ascii="Consolas" w:hAnsi="Consolas"/>
-      <w:sz w:val="22"/>
+      <w:keepNext w:val="0"/>
+      <w:pageBreakBefore w:val="0"/>
+    </w:pPr>
+    <w:rPr>
+      <w:rFonts w:ascii="Courier New" w:hAnsi="Courier New" w:cs="Courier New"/>
+      <w:sz w:val="20"/>
+      <w:szCs w:val="20"/>
+      <w:color w:val="000000"/>
+      <w:b w:val="0"/>
+      <w:i w:val="0"/>
     </w:rPr>
   </w:style>
   <w:style w:type="character" w:customStyle="1" w:styleId="KeywordTok">
@@ -2372,9 +2596,12 @@
     <w:name w:val="VerbatimStringTok"/>
     <w:basedOn w:val="VerbatimChar"/>
     <w:rPr>
-      <w:rFonts w:ascii="Consolas" w:hAnsi="Consolas"/>
-      <w:color w:val="4070A0"/>
-      <w:sz w:val="22"/>
+      <w:rFonts w:ascii="Courier New" w:hAnsi="Courier New" w:cs="Courier New"/>
+      <w:sz w:val="20"/>
+      <w:szCs w:val="20"/>
+      <w:color w:val="000000"/>
+      <w:b w:val="0"/>
+      <w:i w:val="0"/>
     </w:rPr>
   </w:style>
   <w:style w:type="character" w:customStyle="1" w:styleId="SpecialStringTok">
@@ -2575,6 +2802,24 @@
     </w:rPr>
   </w:style>
   <w:style w:type="paragraph" w:styleId="10">
+    <w:rPr>
+      <w:rFonts w:ascii="Times New Roman" w:hAnsi="Times New Roman" w:cs="Times New Roman"/>
+      <w:sz w:val="24"/>
+      <w:szCs w:val="24"/>
+      <w:color w:val="000000"/>
+      <w:b w:val="0"/>
+      <w:i w:val="0"/>
+    </w:rPr>
+    <w:pPr>
+      <w:tabs>
+        <w:tab w:val="right" w:leader="dot" w:pos="9638"/>
+      </w:tabs>
+      <w:spacing w:before="0" w:after="0" w:line="240" w:lineRule="auto"/>
+      <w:ind w:left="0" w:right="0" w:firstLine="0"/>
+      <w:jc w:val="left"/>
+      <w:keepNext w:val="0"/>
+      <w:pageBreakBefore w:val="0"/>
+    </w:pPr>
     <w:name w:val="toc 1"/>
     <w:basedOn w:val="a1"/>
     <w:next w:val="a1"/>
@@ -2584,6 +2829,14 @@
     <w:rsid w:val="00141CD3"/>
   </w:style>
   <w:style w:type="paragraph" w:styleId="22">
+    <w:rPr>
+      <w:rFonts w:ascii="Times New Roman" w:hAnsi="Times New Roman" w:cs="Times New Roman"/>
+      <w:sz w:val="24"/>
+      <w:szCs w:val="24"/>
+      <w:color w:val="000000"/>
+      <w:b w:val="0"/>
+      <w:i w:val="0"/>
+    </w:rPr>
     <w:name w:val="toc 2"/>
     <w:basedOn w:val="a1"/>
     <w:next w:val="a1"/>
@@ -2592,7 +2845,14 @@
     <w:unhideWhenUsed/>
     <w:rsid w:val="00141CD3"/>
     <w:pPr>
-      <w:ind w:left="240"/>
+      <w:tabs>
+        <w:tab w:val="right" w:leader="dot" w:pos="9638"/>
+      </w:tabs>
+      <w:spacing w:before="0" w:after="0" w:line="240" w:lineRule="auto"/>
+      <w:ind w:left="283" w:right="0" w:firstLine="0"/>
+      <w:jc w:val="left"/>
+      <w:keepNext w:val="0"/>
+      <w:pageBreakBefore w:val="0"/>
     </w:pPr>
   </w:style>
   <w:style w:type="character" w:customStyle="1" w:styleId="a6">
@@ -2652,10 +2912,19 @@
         <w:tab w:val="center" w:pos="4677"/>
         <w:tab w:val="right" w:pos="9355"/>
       </w:tabs>
+      <w:spacing w:before="0" w:after="0" w:line="240" w:lineRule="auto"/>
+      <w:ind w:left="0" w:right="0" w:firstLine="0"/>
       <w:jc w:val="center"/>
-    </w:pPr>
-    <w:rPr>
-      <w:rFonts w:cs="Times New Roman"/>
+      <w:keepNext w:val="0"/>
+      <w:pageBreakBefore w:val="0"/>
+    </w:pPr>
+    <w:rPr>
+      <w:rFonts w:ascii="Times New Roman" w:hAnsi="Times New Roman" w:cs="Times New Roman"/>
+      <w:sz w:val="24"/>
+      <w:szCs w:val="24"/>
+      <w:color w:val="000000"/>
+      <w:b w:val="0"/>
+      <w:i w:val="0"/>
     </w:rPr>
   </w:style>
   <w:style w:type="character" w:customStyle="1" w:styleId="afa">
@@ -2732,6 +3001,14 @@
     <w:rsid w:val="00DC6E75"/>
   </w:style>
   <w:style w:type="paragraph" w:styleId="31">
+    <w:rPr>
+      <w:rFonts w:ascii="Times New Roman" w:hAnsi="Times New Roman" w:cs="Times New Roman"/>
+      <w:sz w:val="24"/>
+      <w:szCs w:val="24"/>
+      <w:color w:val="000000"/>
+      <w:b w:val="0"/>
+      <w:i w:val="0"/>
+    </w:rPr>
     <w:name w:val="toc 3"/>
     <w:basedOn w:val="a1"/>
     <w:next w:val="a1"/>
@@ -2741,9 +3018,13 @@
     <w:rsid w:val="00141CD3"/>
     <w:pPr>
       <w:tabs>
-        <w:tab w:val="right" w:leader="dot" w:pos="9962"/>
+        <w:tab w:val="right" w:leader="dot" w:pos="9638"/>
       </w:tabs>
-      <w:ind w:left="480"/>
+      <w:spacing w:before="0" w:after="0" w:line="240" w:lineRule="auto"/>
+      <w:ind w:left="566" w:right="0" w:firstLine="0"/>
+      <w:jc w:val="left"/>
+      <w:keepNext w:val="0"/>
+      <w:pageBreakBefore w:val="0"/>
     </w:pPr>
   </w:style>
   <w:style w:type="paragraph" w:styleId="41">
@@ -2779,12 +3060,24 @@
     </w:pPr>
   </w:style>
   <w:style w:type="paragraph" w:styleId="afe">
+    <w:rPr>
+      <w:rFonts w:ascii="Times New Roman" w:hAnsi="Times New Roman" w:cs="Times New Roman"/>
+      <w:sz w:val="28"/>
+      <w:szCs w:val="28"/>
+      <w:color w:val="000000"/>
+      <w:b w:val="0"/>
+      <w:i w:val="0"/>
+    </w:rPr>
     <w:name w:val="List Paragraph"/>
     <w:basedOn w:val="a1"/>
     <w:rsid w:val="00CC2175"/>
     <w:pPr>
-      <w:ind w:left="567"/>
-      <w:contextualSpacing/>
+      <w:suppressAutoHyphens w:val="1"/>
+      <w:spacing w:before="0" w:after="0" w:line="360" w:lineRule="auto"/>
+      <w:ind w:left="0" w:right="0" w:firstLine="709"/>
+      <w:jc w:val="both"/>
+      <w:keepNext w:val="0"/>
+      <w:pageBreakBefore w:val="0"/>
     </w:pPr>
   </w:style>
   <w:style w:type="paragraph" w:styleId="aff">
@@ -2942,6 +3235,105 @@
       <w:ind w:left="851" w:hanging="567"/>
       <w:contextualSpacing/>
     </w:pPr>
+  </w:style>
+  <w:style w:type="paragraph" w:styleId="GOSTStructuralHeading">
+    <w:rPr>
+      <w:rFonts w:ascii="Times New Roman" w:hAnsi="Times New Roman" w:cs="Times New Roman"/>
+      <w:sz w:val="36"/>
+      <w:szCs w:val="36"/>
+      <w:color w:val="000000"/>
+      <w:b w:val="1"/>
+      <w:i w:val="0"/>
+    </w:rPr>
+    <w:pPr>
+      <w:outlineLvl w:val="0"/>
+      <w:spacing w:before="0" w:after="240" w:line="360" w:lineRule="auto"/>
+      <w:ind w:left="0" w:right="0" w:firstLine="0"/>
+      <w:jc w:val="center"/>
+      <w:keepNext w:val="1"/>
+      <w:pageBreakBefore w:val="1"/>
+    </w:pPr>
+    <w:name w:val="Structural Heading"/>
+    <w:basedOn w:val="a1"/>
+  </w:style>
+  <w:style w:type="paragraph" w:styleId="GOSTAnnotationHeading">
+    <w:rPr>
+      <w:rFonts w:ascii="Times New Roman" w:hAnsi="Times New Roman" w:cs="Times New Roman"/>
+      <w:sz w:val="36"/>
+      <w:szCs w:val="36"/>
+      <w:color w:val="000000"/>
+      <w:b w:val="1"/>
+      <w:i w:val="0"/>
+    </w:rPr>
+    <w:pPr>
+      <w:outlineLvl w:val="9"/>
+      <w:spacing w:before="0" w:after="240" w:line="360" w:lineRule="auto"/>
+      <w:ind w:left="0" w:right="0" w:firstLine="0"/>
+      <w:jc w:val="center"/>
+      <w:keepNext w:val="1"/>
+      <w:pageBreakBefore w:val="1"/>
+    </w:pPr>
+    <w:name w:val="Annotation Heading"/>
+    <w:basedOn w:val="a1"/>
+  </w:style>
+  <w:style w:type="paragraph" w:styleId="GOSTAppendixHeading">
+    <w:rPr>
+      <w:rFonts w:ascii="Times New Roman" w:hAnsi="Times New Roman" w:cs="Times New Roman"/>
+      <w:sz w:val="28"/>
+      <w:szCs w:val="28"/>
+      <w:color w:val="000000"/>
+      <w:b w:val="1"/>
+      <w:i w:val="0"/>
+    </w:rPr>
+    <w:pPr>
+      <w:outlineLvl w:val="0"/>
+      <w:spacing w:before="0" w:after="240" w:line="360" w:lineRule="auto"/>
+      <w:ind w:left="0" w:right="0" w:firstLine="0"/>
+      <w:jc w:val="center"/>
+      <w:keepNext w:val="1"/>
+      <w:pageBreakBefore w:val="1"/>
+    </w:pPr>
+    <w:name w:val="Appendix Heading"/>
+    <w:basedOn w:val="a1"/>
+  </w:style>
+  <w:style w:type="paragraph" w:styleId="GOSTAppendixTitle">
+    <w:rPr>
+      <w:rFonts w:ascii="Times New Roman" w:hAnsi="Times New Roman" w:cs="Times New Roman"/>
+      <w:sz w:val="28"/>
+      <w:szCs w:val="28"/>
+      <w:color w:val="000000"/>
+      <w:b w:val="1"/>
+      <w:i w:val="0"/>
+    </w:rPr>
+    <w:pPr>
+      <w:outlineLvl w:val="9"/>
+      <w:spacing w:before="0" w:after="240" w:line="360" w:lineRule="auto"/>
+      <w:ind w:left="0" w:right="0" w:firstLine="0"/>
+      <w:jc w:val="center"/>
+      <w:keepNext w:val="1"/>
+      <w:pageBreakBefore w:val="0"/>
+    </w:pPr>
+    <w:name w:val="Appendix Title"/>
+    <w:basedOn w:val="a1"/>
+  </w:style>
+  <w:style w:type="paragraph" w:styleId="GOSTListingCaption">
+    <w:rPr>
+      <w:rFonts w:ascii="Times New Roman" w:hAnsi="Times New Roman" w:cs="Times New Roman"/>
+      <w:sz w:val="24"/>
+      <w:szCs w:val="24"/>
+      <w:color w:val="000000"/>
+      <w:b w:val="0"/>
+      <w:i w:val="1"/>
+    </w:rPr>
+    <w:pPr>
+      <w:spacing w:before="120" w:after="0" w:line="240" w:lineRule="auto"/>
+      <w:ind w:left="0" w:right="0" w:firstLine="0"/>
+      <w:jc w:val="left"/>
+      <w:keepNext w:val="1"/>
+      <w:pageBreakBefore w:val="0"/>
+    </w:pPr>
+    <w:name w:val="Listing Caption"/>
+    <w:basedOn w:val="a1"/>
   </w:style>
 </w:styles>
 </file>

</xml_diff>